<commit_message>
Add table filter: all tables in scope or specific tables
Step 2 now has a Tables choice. 'Specific tables' shows a searchable tick-list
of the tables in the ticked solutions (respecting 'Custom tables only'); only the
ticked tables are analysed by every report. Updated the user guide and package README.
</commit_message>
<xml_diff>
--- a/docs/Solution_Analyzer_User_Guide.docx
+++ b/docs/Solution_Analyzer_User_Guide.docx
@@ -1555,6 +1555,19 @@
         <w:spacing w:after="60"/>
       </w:pPr>
       <w:r>
+        <w:t xml:space="preserve">under Tables, choose Specific tables to tick only the tables you want (search by name; the list shows the tables in the ticked solutions);</w:t>
+      </w:r>
+    </w:p>
+    <w:p>
+      <w:pPr>
+        <w:pStyle w:val="ListParagraph"/>
+        <w:numPr>
+          <w:ilvl w:val="1"/>
+          <w:numId w:val="2"/>
+        </w:numPr>
+        <w:spacing w:after="60"/>
+      </w:pPr>
+      <w:r>
         <w:t xml:space="preserve">tick Include system fields to analyse standard columns as well;</w:t>
       </w:r>
     </w:p>
@@ -4463,6 +4476,78 @@
           <w:p>
             <w:r>
               <w:t xml:space="preserve">Skips out-of-the-box Microsoft tables.</w:t>
+            </w:r>
+          </w:p>
+        </w:tc>
+      </w:tr>
+      <w:tr>
+        <w:tc>
+          <w:tcPr>
+            <w:tcW w:type="dxa" w:w="3000"/>
+            <w:tcBorders>
+              <w:top w:val="single" w:color="D2D0CE" w:sz="4"/>
+              <w:left w:val="single" w:color="D2D0CE" w:sz="4"/>
+              <w:bottom w:val="single" w:color="D2D0CE" w:sz="4"/>
+              <w:right w:val="single" w:color="D2D0CE" w:sz="4"/>
+            </w:tcBorders>
+            <w:tcMar>
+              <w:top w:type="dxa" w:w="60"/>
+              <w:left w:type="dxa" w:w="100"/>
+              <w:bottom w:type="dxa" w:w="60"/>
+              <w:right w:type="dxa" w:w="100"/>
+            </w:tcMar>
+          </w:tcPr>
+          <w:p>
+            <w:r>
+              <w:rPr>
+                <w:b/>
+                <w:bCs/>
+              </w:rPr>
+              <w:t xml:space="preserve">Tables</w:t>
+            </w:r>
+          </w:p>
+        </w:tc>
+        <w:tc>
+          <w:tcPr>
+            <w:tcW w:type="dxa" w:w="1300"/>
+            <w:tcBorders>
+              <w:top w:val="single" w:color="D2D0CE" w:sz="4"/>
+              <w:left w:val="single" w:color="D2D0CE" w:sz="4"/>
+              <w:bottom w:val="single" w:color="D2D0CE" w:sz="4"/>
+              <w:right w:val="single" w:color="D2D0CE" w:sz="4"/>
+            </w:tcBorders>
+            <w:tcMar>
+              <w:top w:type="dxa" w:w="60"/>
+              <w:left w:type="dxa" w:w="100"/>
+              <w:bottom w:type="dxa" w:w="60"/>
+              <w:right w:type="dxa" w:w="100"/>
+            </w:tcMar>
+          </w:tcPr>
+          <w:p>
+            <w:r>
+              <w:t xml:space="preserve">All tables in scope</w:t>
+            </w:r>
+          </w:p>
+        </w:tc>
+        <w:tc>
+          <w:tcPr>
+            <w:tcW w:type="dxa" w:w="4726"/>
+            <w:tcBorders>
+              <w:top w:val="single" w:color="D2D0CE" w:sz="4"/>
+              <w:left w:val="single" w:color="D2D0CE" w:sz="4"/>
+              <w:bottom w:val="single" w:color="D2D0CE" w:sz="4"/>
+              <w:right w:val="single" w:color="D2D0CE" w:sz="4"/>
+            </w:tcBorders>
+            <w:tcMar>
+              <w:top w:type="dxa" w:w="60"/>
+              <w:left w:type="dxa" w:w="100"/>
+              <w:bottom w:type="dxa" w:w="60"/>
+              <w:right w:type="dxa" w:w="100"/>
+            </w:tcMar>
+          </w:tcPr>
+          <w:p>
+            <w:r>
+              <w:t xml:space="preserve">Choose Specific tables to analyse only the tables you tick. The list shows the tables in the ticked solutions and can be searched by display or logical name.</w:t>
             </w:r>
           </w:p>
         </w:tc>

</xml_diff>